<commit_message>
Updated pdf to include activity diagram
</commit_message>
<xml_diff>
--- a/Prac5.docx
+++ b/Prac5.docx
@@ -86,6 +86,9 @@
         </w:rPr>
       </w:pPr>
       <w:r>
+        <w:rPr>
+          <w:noProof/>
+        </w:rPr>
         <w:drawing>
           <wp:anchor distT="0" distB="0" distL="114300" distR="114300" simplePos="0" relativeHeight="251658240" behindDoc="0" locked="0" layoutInCell="1" allowOverlap="1" wp14:anchorId="15E98C3D" wp14:editId="621A49D9">
             <wp:simplePos x="0" y="0"/>
@@ -1280,6 +1283,109 @@
     </w:p>
     <w:p>
       <w:pPr>
+        <w:ind w:left="0" w:firstLine="0"/>
+      </w:pPr>
+    </w:p>
+    <w:p>
+      <w:pPr>
+        <w:ind w:left="0" w:firstLine="0"/>
+      </w:pPr>
+    </w:p>
+    <w:p>
+      <w:pPr>
+        <w:rPr>
+          <w:b/>
+          <w:bCs/>
+          <w:u w:val="single"/>
+        </w:rPr>
+      </w:pPr>
+      <w:r>
+        <w:rPr>
+          <w:b/>
+          <w:bCs/>
+          <w:u w:val="single"/>
+        </w:rPr>
+        <w:drawing>
+          <wp:anchor distT="0" distB="0" distL="114300" distR="114300" simplePos="0" relativeHeight="251659264" behindDoc="0" locked="0" layoutInCell="1" allowOverlap="1" wp14:anchorId="5D84ADA9" wp14:editId="392492C0">
+            <wp:simplePos x="0" y="0"/>
+            <wp:positionH relativeFrom="column">
+              <wp:posOffset>-689957</wp:posOffset>
+            </wp:positionH>
+            <wp:positionV relativeFrom="paragraph">
+              <wp:posOffset>230967</wp:posOffset>
+            </wp:positionV>
+            <wp:extent cx="7215447" cy="6437279"/>
+            <wp:effectExtent l="0" t="0" r="5080" b="1905"/>
+            <wp:wrapNone/>
+            <wp:docPr id="239070129" name="Picture 1"/>
+            <wp:cNvGraphicFramePr>
+              <a:graphicFrameLocks xmlns:a="http://schemas.openxmlformats.org/drawingml/2006/main" noChangeAspect="1"/>
+            </wp:cNvGraphicFramePr>
+            <a:graphic xmlns:a="http://schemas.openxmlformats.org/drawingml/2006/main">
+              <a:graphicData uri="http://schemas.openxmlformats.org/drawingml/2006/picture">
+                <pic:pic xmlns:pic="http://schemas.openxmlformats.org/drawingml/2006/picture">
+                  <pic:nvPicPr>
+                    <pic:cNvPr id="239070129" name=""/>
+                    <pic:cNvPicPr/>
+                  </pic:nvPicPr>
+                  <pic:blipFill>
+                    <a:blip r:embed="rId7">
+                      <a:extLst>
+                        <a:ext uri="{28A0092B-C50C-407E-A947-70E740481C1C}">
+                          <a14:useLocalDpi xmlns:a14="http://schemas.microsoft.com/office/drawing/2010/main" val="0"/>
+                        </a:ext>
+                      </a:extLst>
+                    </a:blip>
+                    <a:stretch>
+                      <a:fillRect/>
+                    </a:stretch>
+                  </pic:blipFill>
+                  <pic:spPr>
+                    <a:xfrm>
+                      <a:off x="0" y="0"/>
+                      <a:ext cx="7229915" cy="6450187"/>
+                    </a:xfrm>
+                    <a:prstGeom prst="rect">
+                      <a:avLst/>
+                    </a:prstGeom>
+                  </pic:spPr>
+                </pic:pic>
+              </a:graphicData>
+            </a:graphic>
+            <wp14:sizeRelH relativeFrom="page">
+              <wp14:pctWidth>0</wp14:pctWidth>
+            </wp14:sizeRelH>
+            <wp14:sizeRelV relativeFrom="page">
+              <wp14:pctHeight>0</wp14:pctHeight>
+            </wp14:sizeRelV>
+          </wp:anchor>
+        </w:drawing>
+      </w:r>
+      <w:r>
+        <w:rPr>
+          <w:b/>
+          <w:bCs/>
+          <w:u w:val="single"/>
+        </w:rPr>
+        <w:t>3. Activity Diagram:</w:t>
+      </w:r>
+    </w:p>
+    <w:p>
+      <w:pPr>
+        <w:rPr>
+          <w:b/>
+          <w:bCs/>
+          <w:u w:val="single"/>
+        </w:rPr>
+      </w:pPr>
+    </w:p>
+    <w:p>
+      <w:pPr>
+        <w:rPr>
+          <w:b/>
+          <w:bCs/>
+          <w:u w:val="single"/>
+        </w:rPr>
         <w:sectPr>
           <w:pgSz w:w="11906" w:h="16838"/>
           <w:pgMar w:top="1440" w:right="1444" w:bottom="1637" w:left="1440" w:header="720" w:footer="720" w:gutter="0"/>
@@ -1294,8 +1400,161 @@
       </w:pPr>
       <w:r>
         <w:lastRenderedPageBreak/>
+        <w:drawing>
+          <wp:anchor distT="0" distB="0" distL="114300" distR="114300" simplePos="0" relativeHeight="251660288" behindDoc="0" locked="0" layoutInCell="1" allowOverlap="1" wp14:anchorId="15D75A08" wp14:editId="518EE86F">
+            <wp:simplePos x="0" y="0"/>
+            <wp:positionH relativeFrom="column">
+              <wp:posOffset>-157884</wp:posOffset>
+            </wp:positionH>
+            <wp:positionV relativeFrom="paragraph">
+              <wp:posOffset>-858751</wp:posOffset>
+            </wp:positionV>
+            <wp:extent cx="6766098" cy="5631638"/>
+            <wp:effectExtent l="0" t="0" r="0" b="7620"/>
+            <wp:wrapNone/>
+            <wp:docPr id="791801821" name="Picture 1"/>
+            <wp:cNvGraphicFramePr>
+              <a:graphicFrameLocks xmlns:a="http://schemas.openxmlformats.org/drawingml/2006/main" noChangeAspect="1"/>
+            </wp:cNvGraphicFramePr>
+            <a:graphic xmlns:a="http://schemas.openxmlformats.org/drawingml/2006/main">
+              <a:graphicData uri="http://schemas.openxmlformats.org/drawingml/2006/picture">
+                <pic:pic xmlns:pic="http://schemas.openxmlformats.org/drawingml/2006/picture">
+                  <pic:nvPicPr>
+                    <pic:cNvPr id="791801821" name=""/>
+                    <pic:cNvPicPr/>
+                  </pic:nvPicPr>
+                  <pic:blipFill>
+                    <a:blip r:embed="rId8">
+                      <a:extLst>
+                        <a:ext uri="{28A0092B-C50C-407E-A947-70E740481C1C}">
+                          <a14:useLocalDpi xmlns:a14="http://schemas.microsoft.com/office/drawing/2010/main" val="0"/>
+                        </a:ext>
+                      </a:extLst>
+                    </a:blip>
+                    <a:stretch>
+                      <a:fillRect/>
+                    </a:stretch>
+                  </pic:blipFill>
+                  <pic:spPr>
+                    <a:xfrm>
+                      <a:off x="0" y="0"/>
+                      <a:ext cx="6766098" cy="5631638"/>
+                    </a:xfrm>
+                    <a:prstGeom prst="rect">
+                      <a:avLst/>
+                    </a:prstGeom>
+                  </pic:spPr>
+                </pic:pic>
+              </a:graphicData>
+            </a:graphic>
+            <wp14:sizeRelH relativeFrom="page">
+              <wp14:pctWidth>0</wp14:pctWidth>
+            </wp14:sizeRelH>
+            <wp14:sizeRelV relativeFrom="page">
+              <wp14:pctHeight>0</wp14:pctHeight>
+            </wp14:sizeRelV>
+          </wp:anchor>
+        </w:drawing>
+      </w:r>
+    </w:p>
+    <w:p>
+      <w:pPr>
+        <w:spacing w:after="184" w:line="259" w:lineRule="auto"/>
+        <w:ind w:left="0" w:firstLine="0"/>
+      </w:pPr>
+    </w:p>
+    <w:p>
+      <w:pPr>
+        <w:spacing w:after="184" w:line="259" w:lineRule="auto"/>
+        <w:ind w:left="0" w:firstLine="0"/>
+      </w:pPr>
+    </w:p>
+    <w:p>
+      <w:pPr>
+        <w:spacing w:after="184" w:line="259" w:lineRule="auto"/>
+        <w:ind w:left="0" w:firstLine="0"/>
+      </w:pPr>
+    </w:p>
+    <w:p>
+      <w:pPr>
+        <w:spacing w:after="184" w:line="259" w:lineRule="auto"/>
+        <w:ind w:left="0" w:firstLine="0"/>
+      </w:pPr>
+    </w:p>
+    <w:p>
+      <w:pPr>
+        <w:spacing w:after="184" w:line="259" w:lineRule="auto"/>
+        <w:ind w:left="0" w:firstLine="0"/>
+      </w:pPr>
+    </w:p>
+    <w:p>
+      <w:pPr>
+        <w:spacing w:after="184" w:line="259" w:lineRule="auto"/>
+        <w:ind w:left="0" w:firstLine="0"/>
+      </w:pPr>
+    </w:p>
+    <w:p>
+      <w:pPr>
+        <w:spacing w:after="184" w:line="259" w:lineRule="auto"/>
+        <w:ind w:left="0" w:firstLine="0"/>
+      </w:pPr>
+    </w:p>
+    <w:p>
+      <w:pPr>
+        <w:spacing w:after="184" w:line="259" w:lineRule="auto"/>
+        <w:ind w:left="0" w:firstLine="0"/>
+      </w:pPr>
+    </w:p>
+    <w:p>
+      <w:pPr>
+        <w:spacing w:after="184" w:line="259" w:lineRule="auto"/>
+        <w:ind w:left="0" w:firstLine="0"/>
+      </w:pPr>
+    </w:p>
+    <w:p>
+      <w:pPr>
+        <w:spacing w:after="184" w:line="259" w:lineRule="auto"/>
+        <w:ind w:left="0" w:firstLine="0"/>
+      </w:pPr>
+    </w:p>
+    <w:p>
+      <w:pPr>
+        <w:spacing w:after="184" w:line="259" w:lineRule="auto"/>
+        <w:ind w:left="0" w:firstLine="0"/>
+      </w:pPr>
+      <w:r>
         <w:t xml:space="preserve"> </w:t>
       </w:r>
+    </w:p>
+    <w:p>
+      <w:pPr>
+        <w:spacing w:after="184" w:line="259" w:lineRule="auto"/>
+        <w:ind w:left="0" w:firstLine="0"/>
+      </w:pPr>
+    </w:p>
+    <w:p>
+      <w:pPr>
+        <w:spacing w:after="184" w:line="259" w:lineRule="auto"/>
+        <w:ind w:left="0" w:firstLine="0"/>
+      </w:pPr>
+    </w:p>
+    <w:p>
+      <w:pPr>
+        <w:spacing w:after="184" w:line="259" w:lineRule="auto"/>
+        <w:ind w:left="0" w:firstLine="0"/>
+      </w:pPr>
+    </w:p>
+    <w:p>
+      <w:pPr>
+        <w:spacing w:after="184" w:line="259" w:lineRule="auto"/>
+        <w:ind w:left="0" w:firstLine="0"/>
+      </w:pPr>
+    </w:p>
+    <w:p>
+      <w:pPr>
+        <w:spacing w:after="184" w:line="259" w:lineRule="auto"/>
+        <w:ind w:left="0" w:firstLine="0"/>
+      </w:pPr>
     </w:p>
     <w:p>
       <w:pPr>
@@ -1321,7 +1580,7 @@
                     <pic:cNvPicPr/>
                   </pic:nvPicPr>
                   <pic:blipFill>
-                    <a:blip r:embed="rId7"/>
+                    <a:blip r:embed="rId9"/>
                     <a:stretch>
                       <a:fillRect/>
                     </a:stretch>
@@ -1366,6 +1625,7 @@
         <w:ind w:left="-5" w:right="34"/>
       </w:pPr>
       <w:r>
+        <w:lastRenderedPageBreak/>
         <w:t xml:space="preserve">Command: docker compose run --rm </w:t>
       </w:r>
       <w:proofErr w:type="spellStart"/>
@@ -1498,7 +1758,7 @@
                     <pic:cNvPicPr/>
                   </pic:nvPicPr>
                   <pic:blipFill>
-                    <a:blip r:embed="rId8"/>
+                    <a:blip r:embed="rId10"/>
                     <a:stretch>
                       <a:fillRect/>
                     </a:stretch>
@@ -1562,7 +1822,6 @@
         <w:ind w:left="-5" w:right="34"/>
       </w:pPr>
       <w:r>
-        <w:lastRenderedPageBreak/>
         <w:t xml:space="preserve">debugger showed that incident INC-001 generated the event </w:t>
       </w:r>
     </w:p>
@@ -1598,6 +1857,7 @@
         <w:rPr>
           <w:noProof/>
         </w:rPr>
+        <w:lastRenderedPageBreak/>
         <w:drawing>
           <wp:inline distT="0" distB="0" distL="0" distR="0" wp14:anchorId="21F7A047" wp14:editId="33CC7EB0">
             <wp:extent cx="5731510" cy="3329940"/>
@@ -1612,7 +1872,7 @@
                     <pic:cNvPicPr/>
                   </pic:nvPicPr>
                   <pic:blipFill>
-                    <a:blip r:embed="rId9"/>
+                    <a:blip r:embed="rId11"/>
                     <a:stretch>
                       <a:fillRect/>
                     </a:stretch>

</xml_diff>